<commit_message>
updated for this term
</commit_message>
<xml_diff>
--- a/202620/Syllabus/Syllabus-202620.docx
+++ b/202620/Syllabus/Syllabus-202620.docx
@@ -47,7 +47,7 @@
           <w:sz w:val="48"/>
           <w:szCs w:val="48"/>
         </w:rPr>
-        <w:t>Spring</w:t>
+        <w:t>Winter</w:t>
       </w:r>
       <w:r>
         <w:rPr>
@@ -69,7 +69,7 @@
           <w:sz w:val="48"/>
           <w:szCs w:val="48"/>
         </w:rPr>
-        <w:t>4</w:t>
+        <w:t>5</w:t>
       </w:r>
       <w:r>
         <w:rPr>
@@ -102,7 +102,7 @@
           <w:sz w:val="48"/>
           <w:szCs w:val="48"/>
         </w:rPr>
-        <w:t>5</w:t>
+        <w:t>6</w:t>
       </w:r>
     </w:p>
     <w:p>
@@ -484,38 +484,6 @@
         </w:rPr>
         <w:t>Instructors</w:t>
       </w:r>
-      <w:r>
-        <w:rPr>
-          <w:rFonts w:asciiTheme="minorHAnsi" w:eastAsia="Times New Roman" w:hAnsiTheme="minorHAnsi"/>
-          <w:b/>
-          <w:bCs/>
-          <w:i/>
-          <w:iCs/>
-          <w:sz w:val="40"/>
-          <w:szCs w:val="40"/>
-        </w:rPr>
-        <w:t xml:space="preserve">         </w:t>
-      </w:r>
-      <w:r>
-        <w:rPr>
-          <w:rFonts w:asciiTheme="minorHAnsi" w:hAnsiTheme="minorHAnsi"/>
-          <w:color w:val="000000"/>
-          <w:sz w:val="24"/>
-          <w:szCs w:val="24"/>
-        </w:rPr>
-        <w:t>You are always welcome to contact any of us — </w:t>
-      </w:r>
-      <w:r>
-        <w:rPr>
-          <w:rFonts w:asciiTheme="minorHAnsi" w:hAnsiTheme="minorHAnsi"/>
-          <w:b/>
-          <w:bCs/>
-          <w:color w:val="000000"/>
-          <w:sz w:val="24"/>
-          <w:szCs w:val="24"/>
-        </w:rPr>
-        <w:t>we work as a team.</w:t>
-      </w:r>
     </w:p>
     <w:p>
       <w:pPr>
@@ -533,13 +501,12 @@
     <w:tbl>
       <w:tblPr>
         <w:tblStyle w:val="TableGrid"/>
-        <w:tblW w:w="6301" w:type="dxa"/>
+        <w:tblW w:w="3059" w:type="dxa"/>
         <w:tblInd w:w="755" w:type="dxa"/>
         <w:tblLook w:val="04A0" w:firstRow="1" w:lastRow="0" w:firstColumn="1" w:lastColumn="0" w:noHBand="0" w:noVBand="1"/>
       </w:tblPr>
       <w:tblGrid>
         <w:gridCol w:w="3059"/>
-        <w:gridCol w:w="3242"/>
       </w:tblGrid>
       <w:tr>
         <w:trPr>
@@ -610,71 +577,6 @@
             </w:pPr>
           </w:p>
         </w:tc>
-        <w:tc>
-          <w:tcPr>
-            <w:tcW w:w="3242" w:type="dxa"/>
-          </w:tcPr>
-          <w:p>
-            <w:pPr>
-              <w:spacing w:before="120"/>
-              <w:jc w:val="center"/>
-              <w:rPr>
-                <w:rFonts w:asciiTheme="minorHAnsi" w:hAnsiTheme="minorHAnsi" w:cstheme="minorHAnsi"/>
-                <w:color w:val="000000"/>
-              </w:rPr>
-            </w:pPr>
-            <w:r>
-              <w:rPr>
-                <w:rFonts w:asciiTheme="minorHAnsi" w:hAnsiTheme="minorHAnsi" w:cstheme="minorHAnsi"/>
-                <w:color w:val="000000"/>
-              </w:rPr>
-              <w:t xml:space="preserve">Vibha </w:t>
-            </w:r>
-            <w:proofErr w:type="spellStart"/>
-            <w:r>
-              <w:rPr>
-                <w:rFonts w:asciiTheme="minorHAnsi" w:hAnsiTheme="minorHAnsi" w:cstheme="minorHAnsi"/>
-                <w:color w:val="000000"/>
-              </w:rPr>
-              <w:t>Alangar</w:t>
-            </w:r>
-            <w:proofErr w:type="spellEnd"/>
-            <w:r>
-              <w:rPr>
-                <w:rFonts w:asciiTheme="minorHAnsi" w:hAnsiTheme="minorHAnsi" w:cstheme="minorHAnsi"/>
-                <w:color w:val="000000"/>
-              </w:rPr>
-              <w:t xml:space="preserve"> (Section</w:t>
-            </w:r>
-            <w:r>
-              <w:rPr>
-                <w:rFonts w:asciiTheme="minorHAnsi" w:hAnsiTheme="minorHAnsi" w:cstheme="minorHAnsi"/>
-                <w:color w:val="000000"/>
-              </w:rPr>
-              <w:t xml:space="preserve"> 2)</w:t>
-            </w:r>
-          </w:p>
-          <w:p>
-            <w:pPr>
-              <w:spacing w:before="120"/>
-              <w:jc w:val="center"/>
-              <w:rPr>
-                <w:rFonts w:asciiTheme="minorHAnsi" w:hAnsiTheme="minorHAnsi" w:cstheme="minorHAnsi"/>
-                <w:color w:val="000000"/>
-              </w:rPr>
-            </w:pPr>
-            <w:hyperlink r:id="rId9" w:history="1">
-              <w:r>
-                <w:rPr>
-                  <w:rStyle w:val="Hyperlink"/>
-                  <w:rFonts w:asciiTheme="minorHAnsi" w:hAnsiTheme="minorHAnsi" w:cstheme="minorHAnsi"/>
-                </w:rPr>
-                <w:t>alangavr@rose-hulman.edu</w:t>
-              </w:r>
-            </w:hyperlink>
-          </w:p>
-          <w:p/>
-        </w:tc>
       </w:tr>
       <w:tr>
         <w:trPr>
@@ -722,7 +624,7 @@
                           <pic:cNvPicPr/>
                         </pic:nvPicPr>
                         <pic:blipFill>
-                          <a:blip r:embed="rId10">
+                          <a:blip r:embed="rId9">
                             <a:extLst>
                               <a:ext uri="{28A0092B-C50C-407E-A947-70E740481C1C}">
                                 <a14:useLocalDpi xmlns:a14="http://schemas.microsoft.com/office/drawing/2010/main" val="0"/>
@@ -750,69 +652,6 @@
             </w:r>
           </w:p>
         </w:tc>
-        <w:tc>
-          <w:tcPr>
-            <w:tcW w:w="3242" w:type="dxa"/>
-          </w:tcPr>
-          <w:p>
-            <w:r>
-              <w:t xml:space="preserve">    </w:t>
-            </w:r>
-            <w:r>
-              <w:rPr>
-                <w:noProof/>
-              </w:rPr>
-              <w:drawing>
-                <wp:inline distT="0" distB="0" distL="0" distR="0" wp14:anchorId="2F00972E" wp14:editId="1055FE88">
-                  <wp:extent cx="1539434" cy="1595755"/>
-                  <wp:effectExtent l="0" t="0" r="0" b="4445"/>
-                  <wp:docPr id="1835044546" name="Picture 2"/>
-                  <wp:cNvGraphicFramePr>
-                    <a:graphicFrameLocks xmlns:a="http://schemas.openxmlformats.org/drawingml/2006/main" noChangeAspect="1"/>
-                  </wp:cNvGraphicFramePr>
-                  <a:graphic xmlns:a="http://schemas.openxmlformats.org/drawingml/2006/main">
-                    <a:graphicData uri="http://schemas.openxmlformats.org/drawingml/2006/picture">
-                      <pic:pic xmlns:pic="http://schemas.openxmlformats.org/drawingml/2006/picture">
-                        <pic:nvPicPr>
-                          <pic:cNvPr id="1835044546" name="Picture 1835044546"/>
-                          <pic:cNvPicPr/>
-                        </pic:nvPicPr>
-                        <pic:blipFill rotWithShape="1">
-                          <a:blip r:embed="rId11">
-                            <a:extLst>
-                              <a:ext uri="{28A0092B-C50C-407E-A947-70E740481C1C}">
-                                <a14:useLocalDpi xmlns:a14="http://schemas.microsoft.com/office/drawing/2010/main" val="0"/>
-                              </a:ext>
-                            </a:extLst>
-                          </a:blip>
-                          <a:srcRect l="20611" t="12214" r="16794" b="22901"/>
-                          <a:stretch/>
-                        </pic:blipFill>
-                        <pic:spPr bwMode="auto">
-                          <a:xfrm>
-                            <a:off x="0" y="0"/>
-                            <a:ext cx="1556486" cy="1613431"/>
-                          </a:xfrm>
-                          <a:prstGeom prst="rect">
-                            <a:avLst/>
-                          </a:prstGeom>
-                          <a:ln>
-                            <a:noFill/>
-                          </a:ln>
-                          <a:extLst>
-                            <a:ext uri="{53640926-AAD7-44D8-BBD7-CCE9431645EC}">
-                              <a14:shadowObscured xmlns:a14="http://schemas.microsoft.com/office/drawing/2010/main"/>
-                            </a:ext>
-                          </a:extLst>
-                        </pic:spPr>
-                      </pic:pic>
-                    </a:graphicData>
-                  </a:graphic>
-                </wp:inline>
-              </w:drawing>
-            </w:r>
-          </w:p>
-        </w:tc>
       </w:tr>
     </w:tbl>
     <w:p>
@@ -1052,7 +891,7 @@
         </w:rPr>
         <w:t xml:space="preserve">The </w:t>
       </w:r>
-      <w:hyperlink r:id="rId12" w:history="1">
+      <w:hyperlink r:id="rId10" w:history="1">
         <w:r>
           <w:rPr>
             <w:rFonts w:asciiTheme="minorHAnsi" w:hAnsiTheme="minorHAnsi"/>
@@ -1166,7 +1005,7 @@
         </w:rPr>
         <w:t xml:space="preserve"> sources of help received in completing coursework. This practice not only fosters a culture of honesty and transparency but also prevents misunderstandings that might otherwise escalate to formal proceedings. Students should also be aware of what is appropriate help on homework assignments – see </w:t>
       </w:r>
-      <w:hyperlink r:id="rId13" w:tgtFrame="_blank" w:tooltip="https://rosehulman.sharepoint.com/:w:/r/sites/CS/Shared%20Documents/Pilot%20Integrity%20Policy/IntegrityPilotPolicy%20-%20What%20Constitutes%20Misconduct.docx?d=w72d3dc4b233d4df68e10736359a06c80&amp;csf=1&amp;web=1&amp;e=QWvFcM" w:history="1">
+      <w:hyperlink r:id="rId11" w:tgtFrame="_blank" w:tooltip="https://rosehulman.sharepoint.com/:w:/r/sites/CS/Shared%20Documents/Pilot%20Integrity%20Policy/IntegrityPilotPolicy%20-%20What%20Constitutes%20Misconduct.docx?d=w72d3dc4b233d4df68e10736359a06c80&amp;csf=1&amp;web=1&amp;e=QWvFcM" w:history="1">
         <w:r>
           <w:rPr>
             <w:rStyle w:val="Hyperlink"/>
@@ -1199,7 +1038,7 @@
         </w:rPr>
         <w:t xml:space="preserve">If a case of suspected misconduct arises, it will be submitted to the CSSE Integrity Committee for review (see </w:t>
       </w:r>
-      <w:hyperlink r:id="rId14" w:tgtFrame="_blank" w:tooltip="https://rosehulman.sharepoint.com/:w:/r/sites/CS/Shared%20Documents/Pilot%20Integrity%20Policy/IntegrityPilotPolicy%20-%20Procedures.docx?d=wf4c70babf3ac434ba29d5518dca9f877&amp;csf=1&amp;web=1&amp;e=1efwlT" w:history="1">
+      <w:hyperlink r:id="rId12" w:tgtFrame="_blank" w:tooltip="https://rosehulman.sharepoint.com/:w:/r/sites/CS/Shared%20Documents/Pilot%20Integrity%20Policy/IntegrityPilotPolicy%20-%20Procedures.docx?d=wf4c70babf3ac434ba29d5518dca9f877&amp;csf=1&amp;web=1&amp;e=1efwlT" w:history="1">
         <w:r>
           <w:rPr>
             <w:rStyle w:val="Hyperlink"/>
@@ -1215,7 +1054,7 @@
         </w:rPr>
         <w:t xml:space="preserve"> and possible penalties </w:t>
       </w:r>
-      <w:hyperlink r:id="rId15" w:tgtFrame="_blank" w:tooltip="https://rosehulman.sharepoint.com/:w:/r/sites/CS/Shared%20Documents/Pilot%20Integrity%20Policy/IntegrityPilotPolicy%20-%20Penalties%20%26%20Evidence.docx?d=w916e293ca31a4493bdbdd6b78ed2d3dd&amp;csf=1&amp;web=1&amp;e=wCWF2K" w:history="1">
+      <w:hyperlink r:id="rId13" w:tgtFrame="_blank" w:tooltip="https://rosehulman.sharepoint.com/:w:/r/sites/CS/Shared%20Documents/Pilot%20Integrity%20Policy/IntegrityPilotPolicy%20-%20Penalties%20%26%20Evidence.docx?d=w916e293ca31a4493bdbdd6b78ed2d3dd&amp;csf=1&amp;web=1&amp;e=wCWF2K" w:history="1">
         <w:r>
           <w:rPr>
             <w:rStyle w:val="Hyperlink"/>
@@ -1261,7 +1100,7 @@
                       </pic:cNvPicPr>
                     </pic:nvPicPr>
                     <pic:blipFill>
-                      <a:blip r:embed="rId16">
+                      <a:blip r:embed="rId14">
                         <a:extLst>
                           <a:ext uri="{28A0092B-C50C-407E-A947-70E740481C1C}">
                             <a14:useLocalDpi xmlns:a14="http://schemas.microsoft.com/office/drawing/2010/main" val="0"/>
@@ -1775,7 +1614,42 @@
           <w:rFonts w:asciiTheme="minorHAnsi" w:hAnsiTheme="minorHAnsi"/>
           <w:color w:val="000000"/>
         </w:rPr>
-        <w:t xml:space="preserve"> in most other CSSE courses) for coding.  </w:t>
+        <w:t xml:space="preserve"> in other CSSE </w:t>
+      </w:r>
+      <w:r>
+        <w:rPr>
+          <w:rFonts w:asciiTheme="minorHAnsi" w:hAnsiTheme="minorHAnsi"/>
+          <w:color w:val="000000"/>
+        </w:rPr>
+        <w:t>120 sections</w:t>
+      </w:r>
+      <w:r>
+        <w:rPr>
+          <w:rFonts w:asciiTheme="minorHAnsi" w:hAnsiTheme="minorHAnsi"/>
+          <w:color w:val="000000"/>
+        </w:rPr>
+        <w:t>) for coding</w:t>
+      </w:r>
+      <w:r>
+        <w:rPr>
+          <w:rFonts w:asciiTheme="minorHAnsi" w:hAnsiTheme="minorHAnsi"/>
+          <w:color w:val="000000"/>
+        </w:rPr>
+        <w:t>, except possibly as directed by your instructor for the Capstone Project.</w:t>
+      </w:r>
+      <w:r>
+        <w:rPr>
+          <w:rFonts w:asciiTheme="minorHAnsi" w:hAnsiTheme="minorHAnsi"/>
+          <w:color w:val="000000"/>
+        </w:rPr>
+        <w:t xml:space="preserve"> </w:t>
+      </w:r>
+      <w:r>
+        <w:rPr>
+          <w:rFonts w:asciiTheme="minorHAnsi" w:hAnsiTheme="minorHAnsi"/>
+          <w:color w:val="000000"/>
+        </w:rPr>
+        <w:t xml:space="preserve"> </w:t>
       </w:r>
       <w:r>
         <w:rPr>
@@ -2216,7 +2090,7 @@
         </w:rPr>
         <w:t xml:space="preserve">For example, snippets from the excellent </w:t>
       </w:r>
-      <w:hyperlink r:id="rId17" w:history="1">
+      <w:hyperlink r:id="rId15" w:history="1">
         <w:r>
           <w:rPr>
             <w:rStyle w:val="Hyperlink"/>
@@ -2815,7 +2689,7 @@
                 <w:bCs/>
                 <w:color w:val="000000"/>
               </w:rPr>
-              <w:t>20</w:t>
+              <w:t>15</w:t>
             </w:r>
             <w:r>
               <w:rPr>
@@ -2885,7 +2759,7 @@
                 <w:bCs/>
                 <w:color w:val="000000"/>
               </w:rPr>
-              <w:t>optional</w:t>
+              <w:t>none</w:t>
             </w:r>
           </w:p>
           <w:p>
@@ -2915,7 +2789,16 @@
                 <w:bCs/>
                 <w:color w:val="000000"/>
               </w:rPr>
-              <w:t>20</w:t>
+              <w:t>2</w:t>
+            </w:r>
+            <w:r>
+              <w:rPr>
+                <w:rFonts w:asciiTheme="minorHAnsi" w:hAnsiTheme="minorHAnsi"/>
+                <w:b/>
+                <w:bCs/>
+                <w:color w:val="000000"/>
+              </w:rPr>
+              <w:t>5</w:t>
             </w:r>
             <w:r>
               <w:rPr>
@@ -3770,7 +3653,7 @@
         </w:rPr>
         <w:t>We strongly encourage students to document special academic circumstances with the staff at the </w:t>
       </w:r>
-      <w:hyperlink r:id="rId18" w:tgtFrame="_blank" w:history="1">
+      <w:hyperlink r:id="rId16" w:tgtFrame="_blank" w:history="1">
         <w:r>
           <w:rPr>
             <w:rStyle w:val="Hyperlink"/>
@@ -3889,7 +3772,7 @@
           <w:color w:val="000000"/>
         </w:rPr>
       </w:pPr>
-      <w:hyperlink r:id="rId19" w:tgtFrame="_blank" w:history="1">
+      <w:hyperlink r:id="rId17" w:tgtFrame="_blank" w:history="1">
         <w:r>
           <w:rPr>
             <w:rStyle w:val="Hyperlink"/>
@@ -3912,7 +3795,7 @@
         </w:rPr>
         <w:t xml:space="preserve">  </w:t>
       </w:r>
-      <w:hyperlink r:id="rId20" w:history="1">
+      <w:hyperlink r:id="rId18" w:history="1">
         <w:r>
           <w:rPr>
             <w:rStyle w:val="Hyperlink"/>
@@ -4877,7 +4760,7 @@
         </w:rPr>
         <w:t xml:space="preserve">Additionally, we strongly encourage any student who is feeling stress or experiencing any sort of difficult issue to </w:t>
       </w:r>
-      <w:hyperlink r:id="rId21" w:history="1">
+      <w:hyperlink r:id="rId19" w:history="1">
         <w:r>
           <w:rPr>
             <w:rStyle w:val="Hyperlink"/>
@@ -5049,27 +4932,9 @@
           <w:rFonts w:asciiTheme="minorHAnsi" w:hAnsiTheme="minorHAnsi"/>
           <w:color w:val="000000"/>
         </w:rPr>
-        <w:t xml:space="preserve">Talk with any professor or staff member with whom you feel comfortable, perhaps one of the following CSSE professors are among those who agreed to be an ombudsman to help ensure that our classroom climates are welcoming to all:  Professors Amanda </w:t>
-      </w:r>
-      <w:proofErr w:type="spellStart"/>
-      <w:r>
-        <w:rPr>
-          <w:rStyle w:val="important"/>
-          <w:rFonts w:asciiTheme="minorHAnsi" w:hAnsiTheme="minorHAnsi"/>
-          <w:color w:val="000000"/>
-        </w:rPr>
-        <w:t>Stouder</w:t>
-      </w:r>
-      <w:proofErr w:type="spellEnd"/>
-      <w:r>
-        <w:rPr>
-          <w:rStyle w:val="important"/>
-          <w:rFonts w:asciiTheme="minorHAnsi" w:hAnsiTheme="minorHAnsi"/>
-          <w:color w:val="000000"/>
-        </w:rPr>
-        <w:t xml:space="preserve"> (</w:t>
-      </w:r>
-      <w:hyperlink r:id="rId22" w:history="1">
+        <w:t>Talk with any professor or staff member with whom you feel comfortable, perhaps one of the following CSSE professors are among those who agreed to be an ombudsman to help ensure that our classroom climates are welcoming to all:  Professors Amanda Stouder (</w:t>
+      </w:r>
+      <w:hyperlink r:id="rId20" w:history="1">
         <w:r>
           <w:rPr>
             <w:rStyle w:val="important"/>
@@ -5087,7 +4952,7 @@
         </w:rPr>
         <w:t>), Kim Tracy (</w:t>
       </w:r>
-      <w:hyperlink r:id="rId23" w:history="1">
+      <w:hyperlink r:id="rId21" w:history="1">
         <w:r>
           <w:rPr>
             <w:rStyle w:val="important"/>
@@ -5130,7 +4995,7 @@
         <w:lastRenderedPageBreak/>
         <w:t>Williamson (</w:t>
       </w:r>
-      <w:hyperlink r:id="rId24" w:history="1">
+      <w:hyperlink r:id="rId22" w:history="1">
         <w:r>
           <w:rPr>
             <w:rStyle w:val="important"/>
@@ -5245,7 +5110,7 @@
         </w:rPr>
         <w:t xml:space="preserve">Or, if you want to express concerns in a completely confidential way, the </w:t>
       </w:r>
-      <w:hyperlink r:id="rId25" w:history="1">
+      <w:hyperlink r:id="rId23" w:history="1">
         <w:r>
           <w:rPr>
             <w:rStyle w:val="Hyperlink"/>
@@ -6210,8 +6075,8 @@
       </w:pPr>
     </w:p>
     <w:sectPr>
-      <w:headerReference w:type="even" r:id="rId26"/>
-      <w:headerReference w:type="default" r:id="rId27"/>
+      <w:headerReference w:type="even" r:id="rId24"/>
+      <w:headerReference w:type="default" r:id="rId25"/>
       <w:pgSz w:w="12240" w:h="15840"/>
       <w:pgMar w:top="1152" w:right="1440" w:bottom="576" w:left="1440" w:header="720" w:footer="720" w:gutter="0"/>
       <w:cols w:space="720"/>

</xml_diff>

<commit_message>
changed on-the-computer exam 2 and 3 weights from 12/25 to 20/20
</commit_message>
<xml_diff>
--- a/202620/Syllabus/Syllabus-202620.docx
+++ b/202620/Syllabus/Syllabus-202620.docx
@@ -2689,7 +2689,7 @@
                 <w:bCs/>
                 <w:color w:val="000000"/>
               </w:rPr>
-              <w:t>15</w:t>
+              <w:t>20</w:t>
             </w:r>
             <w:r>
               <w:rPr>
@@ -2789,16 +2789,7 @@
                 <w:bCs/>
                 <w:color w:val="000000"/>
               </w:rPr>
-              <w:t>2</w:t>
-            </w:r>
-            <w:r>
-              <w:rPr>
-                <w:rFonts w:asciiTheme="minorHAnsi" w:hAnsiTheme="minorHAnsi"/>
-                <w:b/>
-                <w:bCs/>
-                <w:color w:val="000000"/>
-              </w:rPr>
-              <w:t>5</w:t>
+              <w:t>20</w:t>
             </w:r>
             <w:r>
               <w:rPr>

</xml_diff>